<commit_message>
Update frontend: multi-box highlights, session expiry, error handling
Yassin's revision, addressing the review of the first version:
- viewer draws every box in a result's bboxes array, falling back to a
  single bbox
- 401/403 on an authenticated call clears the session and redirects to
  login with a notice; a wrong password on login is excluded
- delete and document-list failures show the backend's reason, and a
  failed list load is no longer shown as an empty archive
- upload errors show the backend's detail text; upload rows are keyed by
  unique id so same-named files do not collide
- wording now says the viewer shows the preprocessed page image
- tests: 18 unit (reproduced locally) and 31 e2e scenarios (reported by
  the author, run against the mock backend only)

Docs updated to match, plus 11 new UI screenshots. Annex B's data
dictionary now has raw_text, norm_text and normalizer_version; its ER
diagram is deliberately not yet redrawn pending the final schema.
</commit_message>
<xml_diff>
--- a/frontend/docs/Annexes_B_C_D_Design.docx
+++ b/frontend/docs/Annexes_B_C_D_Design.docx
@@ -627,10 +627,10 @@
         </w:tblBorders>
       </w:tblPr>
       <w:tblGrid>
-        <w:gridCol w:w="2300"/>
+        <w:gridCol w:w="2800"/>
         <w:gridCol w:w="1300"/>
-        <w:gridCol w:w="2300"/>
-        <w:gridCol w:w="3126"/>
+        <w:gridCol w:w="1900"/>
+        <w:gridCol w:w="3026"/>
       </w:tblGrid>
       <w:tr>
         <w:trPr>
@@ -638,7 +638,7 @@
         </w:trPr>
         <w:tc>
           <w:tcPr>
-            <w:tcW w:type="dxa" w:w="2300"/>
+            <w:tcW w:type="dxa" w:w="2800"/>
             <w:tcBorders>
               <w:top w:val="single" w:color="808080" w:sz="4"/>
               <w:left w:val="single" w:color="808080" w:sz="4"/>
@@ -706,7 +706,7 @@
         </w:tc>
         <w:tc>
           <w:tcPr>
-            <w:tcW w:type="dxa" w:w="2300"/>
+            <w:tcW w:type="dxa" w:w="1900"/>
             <w:tcBorders>
               <w:top w:val="single" w:color="808080" w:sz="4"/>
               <w:left w:val="single" w:color="808080" w:sz="4"/>
@@ -740,7 +740,7 @@
         </w:tc>
         <w:tc>
           <w:tcPr>
-            <w:tcW w:type="dxa" w:w="3126"/>
+            <w:tcW w:type="dxa" w:w="3026"/>
             <w:tcBorders>
               <w:top w:val="single" w:color="808080" w:sz="4"/>
               <w:left w:val="single" w:color="808080" w:sz="4"/>
@@ -779,7 +779,7 @@
         </w:trPr>
         <w:tc>
           <w:tcPr>
-            <w:tcW w:type="dxa" w:w="2300"/>
+            <w:tcW w:type="dxa" w:w="2800"/>
             <w:tcBorders>
               <w:top w:val="single" w:color="808080" w:sz="4"/>
               <w:left w:val="single" w:color="808080" w:sz="4"/>
@@ -841,7 +841,7 @@
         </w:tc>
         <w:tc>
           <w:tcPr>
-            <w:tcW w:type="dxa" w:w="2300"/>
+            <w:tcW w:type="dxa" w:w="1900"/>
             <w:tcBorders>
               <w:top w:val="single" w:color="808080" w:sz="4"/>
               <w:left w:val="single" w:color="808080" w:sz="4"/>
@@ -872,7 +872,7 @@
         </w:tc>
         <w:tc>
           <w:tcPr>
-            <w:tcW w:type="dxa" w:w="3126"/>
+            <w:tcW w:type="dxa" w:w="3026"/>
             <w:tcBorders>
               <w:top w:val="single" w:color="808080" w:sz="4"/>
               <w:left w:val="single" w:color="808080" w:sz="4"/>
@@ -908,7 +908,7 @@
         </w:trPr>
         <w:tc>
           <w:tcPr>
-            <w:tcW w:type="dxa" w:w="2300"/>
+            <w:tcW w:type="dxa" w:w="2800"/>
             <w:tcBorders>
               <w:top w:val="single" w:color="808080" w:sz="4"/>
               <w:left w:val="single" w:color="808080" w:sz="4"/>
@@ -970,7 +970,7 @@
         </w:tc>
         <w:tc>
           <w:tcPr>
-            <w:tcW w:type="dxa" w:w="2300"/>
+            <w:tcW w:type="dxa" w:w="1900"/>
             <w:tcBorders>
               <w:top w:val="single" w:color="808080" w:sz="4"/>
               <w:left w:val="single" w:color="808080" w:sz="4"/>
@@ -1001,7 +1001,7 @@
         </w:tc>
         <w:tc>
           <w:tcPr>
-            <w:tcW w:type="dxa" w:w="3126"/>
+            <w:tcW w:type="dxa" w:w="3026"/>
             <w:tcBorders>
               <w:top w:val="single" w:color="808080" w:sz="4"/>
               <w:left w:val="single" w:color="808080" w:sz="4"/>
@@ -1037,7 +1037,7 @@
         </w:trPr>
         <w:tc>
           <w:tcPr>
-            <w:tcW w:type="dxa" w:w="2300"/>
+            <w:tcW w:type="dxa" w:w="2800"/>
             <w:tcBorders>
               <w:top w:val="single" w:color="808080" w:sz="4"/>
               <w:left w:val="single" w:color="808080" w:sz="4"/>
@@ -1099,7 +1099,7 @@
         </w:tc>
         <w:tc>
           <w:tcPr>
-            <w:tcW w:type="dxa" w:w="2300"/>
+            <w:tcW w:type="dxa" w:w="1900"/>
             <w:tcBorders>
               <w:top w:val="single" w:color="808080" w:sz="4"/>
               <w:left w:val="single" w:color="808080" w:sz="4"/>
@@ -1130,7 +1130,7 @@
         </w:tc>
         <w:tc>
           <w:tcPr>
-            <w:tcW w:type="dxa" w:w="3126"/>
+            <w:tcW w:type="dxa" w:w="3026"/>
             <w:tcBorders>
               <w:top w:val="single" w:color="808080" w:sz="4"/>
               <w:left w:val="single" w:color="808080" w:sz="4"/>
@@ -1166,7 +1166,7 @@
         </w:trPr>
         <w:tc>
           <w:tcPr>
-            <w:tcW w:type="dxa" w:w="2300"/>
+            <w:tcW w:type="dxa" w:w="2800"/>
             <w:tcBorders>
               <w:top w:val="single" w:color="808080" w:sz="4"/>
               <w:left w:val="single" w:color="808080" w:sz="4"/>
@@ -1228,7 +1228,7 @@
         </w:tc>
         <w:tc>
           <w:tcPr>
-            <w:tcW w:type="dxa" w:w="2300"/>
+            <w:tcW w:type="dxa" w:w="1900"/>
             <w:tcBorders>
               <w:top w:val="single" w:color="808080" w:sz="4"/>
               <w:left w:val="single" w:color="808080" w:sz="4"/>
@@ -1259,7 +1259,7 @@
         </w:tc>
         <w:tc>
           <w:tcPr>
-            <w:tcW w:type="dxa" w:w="3126"/>
+            <w:tcW w:type="dxa" w:w="3026"/>
             <w:tcBorders>
               <w:top w:val="single" w:color="808080" w:sz="4"/>
               <w:left w:val="single" w:color="808080" w:sz="4"/>
@@ -1295,7 +1295,7 @@
         </w:trPr>
         <w:tc>
           <w:tcPr>
-            <w:tcW w:type="dxa" w:w="2300"/>
+            <w:tcW w:type="dxa" w:w="2800"/>
             <w:tcBorders>
               <w:top w:val="single" w:color="808080" w:sz="4"/>
               <w:left w:val="single" w:color="808080" w:sz="4"/>
@@ -1357,7 +1357,7 @@
         </w:tc>
         <w:tc>
           <w:tcPr>
-            <w:tcW w:type="dxa" w:w="2300"/>
+            <w:tcW w:type="dxa" w:w="1900"/>
             <w:tcBorders>
               <w:top w:val="single" w:color="808080" w:sz="4"/>
               <w:left w:val="single" w:color="808080" w:sz="4"/>
@@ -1388,7 +1388,7 @@
         </w:tc>
         <w:tc>
           <w:tcPr>
-            <w:tcW w:type="dxa" w:w="3126"/>
+            <w:tcW w:type="dxa" w:w="3026"/>
             <w:tcBorders>
               <w:top w:val="single" w:color="808080" w:sz="4"/>
               <w:left w:val="single" w:color="808080" w:sz="4"/>
@@ -1424,7 +1424,7 @@
         </w:trPr>
         <w:tc>
           <w:tcPr>
-            <w:tcW w:type="dxa" w:w="2300"/>
+            <w:tcW w:type="dxa" w:w="2800"/>
             <w:tcBorders>
               <w:top w:val="single" w:color="808080" w:sz="4"/>
               <w:left w:val="single" w:color="808080" w:sz="4"/>
@@ -1486,7 +1486,7 @@
         </w:tc>
         <w:tc>
           <w:tcPr>
-            <w:tcW w:type="dxa" w:w="2300"/>
+            <w:tcW w:type="dxa" w:w="1900"/>
             <w:tcBorders>
               <w:top w:val="single" w:color="808080" w:sz="4"/>
               <w:left w:val="single" w:color="808080" w:sz="4"/>
@@ -1517,7 +1517,7 @@
         </w:tc>
         <w:tc>
           <w:tcPr>
-            <w:tcW w:type="dxa" w:w="3126"/>
+            <w:tcW w:type="dxa" w:w="3026"/>
             <w:tcBorders>
               <w:top w:val="single" w:color="808080" w:sz="4"/>
               <w:left w:val="single" w:color="808080" w:sz="4"/>
@@ -1553,7 +1553,7 @@
         </w:trPr>
         <w:tc>
           <w:tcPr>
-            <w:tcW w:type="dxa" w:w="2300"/>
+            <w:tcW w:type="dxa" w:w="2800"/>
             <w:tcBorders>
               <w:top w:val="single" w:color="808080" w:sz="4"/>
               <w:left w:val="single" w:color="808080" w:sz="4"/>
@@ -1615,7 +1615,7 @@
         </w:tc>
         <w:tc>
           <w:tcPr>
-            <w:tcW w:type="dxa" w:w="2300"/>
+            <w:tcW w:type="dxa" w:w="1900"/>
             <w:tcBorders>
               <w:top w:val="single" w:color="808080" w:sz="4"/>
               <w:left w:val="single" w:color="808080" w:sz="4"/>
@@ -1646,7 +1646,7 @@
         </w:tc>
         <w:tc>
           <w:tcPr>
-            <w:tcW w:type="dxa" w:w="3126"/>
+            <w:tcW w:type="dxa" w:w="3026"/>
             <w:tcBorders>
               <w:top w:val="single" w:color="808080" w:sz="4"/>
               <w:left w:val="single" w:color="808080" w:sz="4"/>
@@ -1682,7 +1682,7 @@
         </w:trPr>
         <w:tc>
           <w:tcPr>
-            <w:tcW w:type="dxa" w:w="2300"/>
+            <w:tcW w:type="dxa" w:w="2800"/>
             <w:tcBorders>
               <w:top w:val="single" w:color="808080" w:sz="4"/>
               <w:left w:val="single" w:color="808080" w:sz="4"/>
@@ -1744,7 +1744,7 @@
         </w:tc>
         <w:tc>
           <w:tcPr>
-            <w:tcW w:type="dxa" w:w="2300"/>
+            <w:tcW w:type="dxa" w:w="1900"/>
             <w:tcBorders>
               <w:top w:val="single" w:color="808080" w:sz="4"/>
               <w:left w:val="single" w:color="808080" w:sz="4"/>
@@ -1775,7 +1775,7 @@
         </w:tc>
         <w:tc>
           <w:tcPr>
-            <w:tcW w:type="dxa" w:w="3126"/>
+            <w:tcW w:type="dxa" w:w="3026"/>
             <w:tcBorders>
               <w:top w:val="single" w:color="808080" w:sz="4"/>
               <w:left w:val="single" w:color="808080" w:sz="4"/>
@@ -1811,7 +1811,7 @@
         </w:trPr>
         <w:tc>
           <w:tcPr>
-            <w:tcW w:type="dxa" w:w="2300"/>
+            <w:tcW w:type="dxa" w:w="2800"/>
             <w:tcBorders>
               <w:top w:val="single" w:color="808080" w:sz="4"/>
               <w:left w:val="single" w:color="808080" w:sz="4"/>
@@ -1873,7 +1873,7 @@
         </w:tc>
         <w:tc>
           <w:tcPr>
-            <w:tcW w:type="dxa" w:w="2300"/>
+            <w:tcW w:type="dxa" w:w="1900"/>
             <w:tcBorders>
               <w:top w:val="single" w:color="808080" w:sz="4"/>
               <w:left w:val="single" w:color="808080" w:sz="4"/>
@@ -1904,7 +1904,7 @@
         </w:tc>
         <w:tc>
           <w:tcPr>
-            <w:tcW w:type="dxa" w:w="3126"/>
+            <w:tcW w:type="dxa" w:w="3026"/>
             <w:tcBorders>
               <w:top w:val="single" w:color="808080" w:sz="4"/>
               <w:left w:val="single" w:color="808080" w:sz="4"/>
@@ -1940,7 +1940,7 @@
         </w:trPr>
         <w:tc>
           <w:tcPr>
-            <w:tcW w:type="dxa" w:w="2300"/>
+            <w:tcW w:type="dxa" w:w="2800"/>
             <w:tcBorders>
               <w:top w:val="single" w:color="808080" w:sz="4"/>
               <w:left w:val="single" w:color="808080" w:sz="4"/>
@@ -2002,7 +2002,7 @@
         </w:tc>
         <w:tc>
           <w:tcPr>
-            <w:tcW w:type="dxa" w:w="2300"/>
+            <w:tcW w:type="dxa" w:w="1900"/>
             <w:tcBorders>
               <w:top w:val="single" w:color="808080" w:sz="4"/>
               <w:left w:val="single" w:color="808080" w:sz="4"/>
@@ -2033,7 +2033,7 @@
         </w:tc>
         <w:tc>
           <w:tcPr>
-            <w:tcW w:type="dxa" w:w="3126"/>
+            <w:tcW w:type="dxa" w:w="3026"/>
             <w:tcBorders>
               <w:top w:val="single" w:color="808080" w:sz="4"/>
               <w:left w:val="single" w:color="808080" w:sz="4"/>
@@ -2069,7 +2069,7 @@
         </w:trPr>
         <w:tc>
           <w:tcPr>
-            <w:tcW w:type="dxa" w:w="2300"/>
+            <w:tcW w:type="dxa" w:w="2800"/>
             <w:tcBorders>
               <w:top w:val="single" w:color="808080" w:sz="4"/>
               <w:left w:val="single" w:color="808080" w:sz="4"/>
@@ -2131,7 +2131,7 @@
         </w:tc>
         <w:tc>
           <w:tcPr>
-            <w:tcW w:type="dxa" w:w="2300"/>
+            <w:tcW w:type="dxa" w:w="1900"/>
             <w:tcBorders>
               <w:top w:val="single" w:color="808080" w:sz="4"/>
               <w:left w:val="single" w:color="808080" w:sz="4"/>
@@ -2162,7 +2162,7 @@
         </w:tc>
         <w:tc>
           <w:tcPr>
-            <w:tcW w:type="dxa" w:w="3126"/>
+            <w:tcW w:type="dxa" w:w="3026"/>
             <w:tcBorders>
               <w:top w:val="single" w:color="808080" w:sz="4"/>
               <w:left w:val="single" w:color="808080" w:sz="4"/>
@@ -2198,7 +2198,7 @@
         </w:trPr>
         <w:tc>
           <w:tcPr>
-            <w:tcW w:type="dxa" w:w="2300"/>
+            <w:tcW w:type="dxa" w:w="2800"/>
             <w:tcBorders>
               <w:top w:val="single" w:color="808080" w:sz="4"/>
               <w:left w:val="single" w:color="808080" w:sz="4"/>
@@ -2260,7 +2260,7 @@
         </w:tc>
         <w:tc>
           <w:tcPr>
-            <w:tcW w:type="dxa" w:w="2300"/>
+            <w:tcW w:type="dxa" w:w="1900"/>
             <w:tcBorders>
               <w:top w:val="single" w:color="808080" w:sz="4"/>
               <w:left w:val="single" w:color="808080" w:sz="4"/>
@@ -2291,7 +2291,7 @@
         </w:tc>
         <w:tc>
           <w:tcPr>
-            <w:tcW w:type="dxa" w:w="3126"/>
+            <w:tcW w:type="dxa" w:w="3026"/>
             <w:tcBorders>
               <w:top w:val="single" w:color="808080" w:sz="4"/>
               <w:left w:val="single" w:color="808080" w:sz="4"/>
@@ -2327,7 +2327,7 @@
         </w:trPr>
         <w:tc>
           <w:tcPr>
-            <w:tcW w:type="dxa" w:w="2300"/>
+            <w:tcW w:type="dxa" w:w="2800"/>
             <w:tcBorders>
               <w:top w:val="single" w:color="808080" w:sz="4"/>
               <w:left w:val="single" w:color="808080" w:sz="4"/>
@@ -2389,7 +2389,7 @@
         </w:tc>
         <w:tc>
           <w:tcPr>
-            <w:tcW w:type="dxa" w:w="2300"/>
+            <w:tcW w:type="dxa" w:w="1900"/>
             <w:tcBorders>
               <w:top w:val="single" w:color="808080" w:sz="4"/>
               <w:left w:val="single" w:color="808080" w:sz="4"/>
@@ -2420,7 +2420,7 @@
         </w:tc>
         <w:tc>
           <w:tcPr>
-            <w:tcW w:type="dxa" w:w="3126"/>
+            <w:tcW w:type="dxa" w:w="3026"/>
             <w:tcBorders>
               <w:top w:val="single" w:color="808080" w:sz="4"/>
               <w:left w:val="single" w:color="808080" w:sz="4"/>
@@ -2456,7 +2456,7 @@
         </w:trPr>
         <w:tc>
           <w:tcPr>
-            <w:tcW w:type="dxa" w:w="2300"/>
+            <w:tcW w:type="dxa" w:w="2800"/>
             <w:tcBorders>
               <w:top w:val="single" w:color="808080" w:sz="4"/>
               <w:left w:val="single" w:color="808080" w:sz="4"/>
@@ -2518,7 +2518,7 @@
         </w:tc>
         <w:tc>
           <w:tcPr>
-            <w:tcW w:type="dxa" w:w="2300"/>
+            <w:tcW w:type="dxa" w:w="1900"/>
             <w:tcBorders>
               <w:top w:val="single" w:color="808080" w:sz="4"/>
               <w:left w:val="single" w:color="808080" w:sz="4"/>
@@ -2549,7 +2549,7 @@
         </w:tc>
         <w:tc>
           <w:tcPr>
-            <w:tcW w:type="dxa" w:w="3126"/>
+            <w:tcW w:type="dxa" w:w="3026"/>
             <w:tcBorders>
               <w:top w:val="single" w:color="808080" w:sz="4"/>
               <w:left w:val="single" w:color="808080" w:sz="4"/>
@@ -2585,7 +2585,7 @@
         </w:trPr>
         <w:tc>
           <w:tcPr>
-            <w:tcW w:type="dxa" w:w="2300"/>
+            <w:tcW w:type="dxa" w:w="2800"/>
             <w:tcBorders>
               <w:top w:val="single" w:color="808080" w:sz="4"/>
               <w:left w:val="single" w:color="808080" w:sz="4"/>
@@ -2647,7 +2647,7 @@
         </w:tc>
         <w:tc>
           <w:tcPr>
-            <w:tcW w:type="dxa" w:w="2300"/>
+            <w:tcW w:type="dxa" w:w="1900"/>
             <w:tcBorders>
               <w:top w:val="single" w:color="808080" w:sz="4"/>
               <w:left w:val="single" w:color="808080" w:sz="4"/>
@@ -2678,7 +2678,7 @@
         </w:tc>
         <w:tc>
           <w:tcPr>
-            <w:tcW w:type="dxa" w:w="3126"/>
+            <w:tcW w:type="dxa" w:w="3026"/>
             <w:tcBorders>
               <w:top w:val="single" w:color="808080" w:sz="4"/>
               <w:left w:val="single" w:color="808080" w:sz="4"/>
@@ -2714,7 +2714,7 @@
         </w:trPr>
         <w:tc>
           <w:tcPr>
-            <w:tcW w:type="dxa" w:w="2300"/>
+            <w:tcW w:type="dxa" w:w="2800"/>
             <w:tcBorders>
               <w:top w:val="single" w:color="808080" w:sz="4"/>
               <w:left w:val="single" w:color="808080" w:sz="4"/>
@@ -2776,7 +2776,7 @@
         </w:tc>
         <w:tc>
           <w:tcPr>
-            <w:tcW w:type="dxa" w:w="2300"/>
+            <w:tcW w:type="dxa" w:w="1900"/>
             <w:tcBorders>
               <w:top w:val="single" w:color="808080" w:sz="4"/>
               <w:left w:val="single" w:color="808080" w:sz="4"/>
@@ -2807,7 +2807,7 @@
         </w:tc>
         <w:tc>
           <w:tcPr>
-            <w:tcW w:type="dxa" w:w="3126"/>
+            <w:tcW w:type="dxa" w:w="3026"/>
             <w:tcBorders>
               <w:top w:val="single" w:color="808080" w:sz="4"/>
               <w:left w:val="single" w:color="808080" w:sz="4"/>
@@ -2843,7 +2843,7 @@
         </w:trPr>
         <w:tc>
           <w:tcPr>
-            <w:tcW w:type="dxa" w:w="2300"/>
+            <w:tcW w:type="dxa" w:w="2800"/>
             <w:tcBorders>
               <w:top w:val="single" w:color="808080" w:sz="4"/>
               <w:left w:val="single" w:color="808080" w:sz="4"/>
@@ -2905,7 +2905,7 @@
         </w:tc>
         <w:tc>
           <w:tcPr>
-            <w:tcW w:type="dxa" w:w="2300"/>
+            <w:tcW w:type="dxa" w:w="1900"/>
             <w:tcBorders>
               <w:top w:val="single" w:color="808080" w:sz="4"/>
               <w:left w:val="single" w:color="808080" w:sz="4"/>
@@ -2936,32 +2936,32 @@
         </w:tc>
         <w:tc>
           <w:tcPr>
-            <w:tcW w:type="dxa" w:w="3126"/>
-            <w:tcBorders>
-              <w:top w:val="single" w:color="808080" w:sz="4"/>
-              <w:left w:val="single" w:color="808080" w:sz="4"/>
-              <w:bottom w:val="single" w:color="808080" w:sz="4"/>
-              <w:right w:val="single" w:color="808080" w:sz="4"/>
-            </w:tcBorders>
-            <w:tcMar>
-              <w:top w:type="dxa" w:w="60"/>
-              <w:left w:type="dxa" w:w="90"/>
-              <w:bottom w:type="dxa" w:w="60"/>
-              <w:right w:type="dxa" w:w="90"/>
-            </w:tcMar>
-          </w:tcPr>
-          <w:p>
-            <w:pPr>
-              <w:spacing w:after="20"/>
-              <w:jc w:val="left"/>
-            </w:pPr>
-            <w:r>
-              <w:rPr>
-                <w:rFonts w:ascii="Times New Roman" w:cs="Times New Roman" w:eastAsia="Times New Roman" w:hAnsi="Times New Roman"/>
-                <w:sz w:val="18"/>
-                <w:szCs w:val="18"/>
-              </w:rPr>
-              <w:t xml:space="preserve">Location of the rendered page image served to the viewer.</w:t>
+            <w:tcW w:type="dxa" w:w="3026"/>
+            <w:tcBorders>
+              <w:top w:val="single" w:color="808080" w:sz="4"/>
+              <w:left w:val="single" w:color="808080" w:sz="4"/>
+              <w:bottom w:val="single" w:color="808080" w:sz="4"/>
+              <w:right w:val="single" w:color="808080" w:sz="4"/>
+            </w:tcBorders>
+            <w:tcMar>
+              <w:top w:type="dxa" w:w="60"/>
+              <w:left w:type="dxa" w:w="90"/>
+              <w:bottom w:type="dxa" w:w="60"/>
+              <w:right w:type="dxa" w:w="90"/>
+            </w:tcMar>
+          </w:tcPr>
+          <w:p>
+            <w:pPr>
+              <w:spacing w:after="20"/>
+              <w:jc w:val="left"/>
+            </w:pPr>
+            <w:r>
+              <w:rPr>
+                <w:rFonts w:ascii="Times New Roman" w:cs="Times New Roman" w:eastAsia="Times New Roman" w:hAnsi="Times New Roman"/>
+                <w:sz w:val="18"/>
+                <w:szCs w:val="18"/>
+              </w:rPr>
+              <w:t xml:space="preserve">Location of the preprocessed page image (the image the OCR read) served to the viewer.</w:t>
             </w:r>
           </w:p>
         </w:tc>
@@ -2972,7 +2972,7 @@
         </w:trPr>
         <w:tc>
           <w:tcPr>
-            <w:tcW w:type="dxa" w:w="2300"/>
+            <w:tcW w:type="dxa" w:w="2800"/>
             <w:tcBorders>
               <w:top w:val="single" w:color="808080" w:sz="4"/>
               <w:left w:val="single" w:color="808080" w:sz="4"/>
@@ -3034,7 +3034,7 @@
         </w:tc>
         <w:tc>
           <w:tcPr>
-            <w:tcW w:type="dxa" w:w="2300"/>
+            <w:tcW w:type="dxa" w:w="1900"/>
             <w:tcBorders>
               <w:top w:val="single" w:color="808080" w:sz="4"/>
               <w:left w:val="single" w:color="808080" w:sz="4"/>
@@ -3065,32 +3065,32 @@
         </w:tc>
         <w:tc>
           <w:tcPr>
-            <w:tcW w:type="dxa" w:w="3126"/>
-            <w:tcBorders>
-              <w:top w:val="single" w:color="808080" w:sz="4"/>
-              <w:left w:val="single" w:color="808080" w:sz="4"/>
-              <w:bottom w:val="single" w:color="808080" w:sz="4"/>
-              <w:right w:val="single" w:color="808080" w:sz="4"/>
-            </w:tcBorders>
-            <w:tcMar>
-              <w:top w:type="dxa" w:w="60"/>
-              <w:left w:type="dxa" w:w="90"/>
-              <w:bottom w:type="dxa" w:w="60"/>
-              <w:right w:type="dxa" w:w="90"/>
-            </w:tcMar>
-          </w:tcPr>
-          <w:p>
-            <w:pPr>
-              <w:spacing w:after="20"/>
-              <w:jc w:val="left"/>
-            </w:pPr>
-            <w:r>
-              <w:rPr>
-                <w:rFonts w:ascii="Times New Roman" w:cs="Times New Roman" w:eastAsia="Times New Roman" w:hAnsi="Times New Roman"/>
-                <w:sz w:val="18"/>
-                <w:szCs w:val="18"/>
-              </w:rPr>
-              <w:t xml:space="preserve">Size of the analysed image; used to normalize OCR boxes.</w:t>
+            <w:tcW w:type="dxa" w:w="3026"/>
+            <w:tcBorders>
+              <w:top w:val="single" w:color="808080" w:sz="4"/>
+              <w:left w:val="single" w:color="808080" w:sz="4"/>
+              <w:bottom w:val="single" w:color="808080" w:sz="4"/>
+              <w:right w:val="single" w:color="808080" w:sz="4"/>
+            </w:tcBorders>
+            <w:tcMar>
+              <w:top w:type="dxa" w:w="60"/>
+              <w:left w:type="dxa" w:w="90"/>
+              <w:bottom w:type="dxa" w:w="60"/>
+              <w:right w:type="dxa" w:w="90"/>
+            </w:tcMar>
+          </w:tcPr>
+          <w:p>
+            <w:pPr>
+              <w:spacing w:after="20"/>
+              <w:jc w:val="left"/>
+            </w:pPr>
+            <w:r>
+              <w:rPr>
+                <w:rFonts w:ascii="Times New Roman" w:cs="Times New Roman" w:eastAsia="Times New Roman" w:hAnsi="Times New Roman"/>
+                <w:sz w:val="18"/>
+                <w:szCs w:val="18"/>
+              </w:rPr>
+              <w:t xml:space="preserve">Size of the preprocessed page image; used to normalize OCR boxes.</w:t>
             </w:r>
           </w:p>
         </w:tc>
@@ -3101,7 +3101,7 @@
         </w:trPr>
         <w:tc>
           <w:tcPr>
-            <w:tcW w:type="dxa" w:w="2300"/>
+            <w:tcW w:type="dxa" w:w="2800"/>
             <w:tcBorders>
               <w:top w:val="single" w:color="808080" w:sz="4"/>
               <w:left w:val="single" w:color="808080" w:sz="4"/>
@@ -3163,7 +3163,7 @@
         </w:tc>
         <w:tc>
           <w:tcPr>
-            <w:tcW w:type="dxa" w:w="2300"/>
+            <w:tcW w:type="dxa" w:w="1900"/>
             <w:tcBorders>
               <w:top w:val="single" w:color="808080" w:sz="4"/>
               <w:left w:val="single" w:color="808080" w:sz="4"/>
@@ -3194,7 +3194,7 @@
         </w:tc>
         <w:tc>
           <w:tcPr>
-            <w:tcW w:type="dxa" w:w="3126"/>
+            <w:tcW w:type="dxa" w:w="3026"/>
             <w:tcBorders>
               <w:top w:val="single" w:color="808080" w:sz="4"/>
               <w:left w:val="single" w:color="808080" w:sz="4"/>
@@ -3230,7 +3230,7 @@
         </w:trPr>
         <w:tc>
           <w:tcPr>
-            <w:tcW w:type="dxa" w:w="2300"/>
+            <w:tcW w:type="dxa" w:w="2800"/>
             <w:tcBorders>
               <w:top w:val="single" w:color="808080" w:sz="4"/>
               <w:left w:val="single" w:color="808080" w:sz="4"/>
@@ -3292,7 +3292,7 @@
         </w:tc>
         <w:tc>
           <w:tcPr>
-            <w:tcW w:type="dxa" w:w="2300"/>
+            <w:tcW w:type="dxa" w:w="1900"/>
             <w:tcBorders>
               <w:top w:val="single" w:color="808080" w:sz="4"/>
               <w:left w:val="single" w:color="808080" w:sz="4"/>
@@ -3323,7 +3323,7 @@
         </w:tc>
         <w:tc>
           <w:tcPr>
-            <w:tcW w:type="dxa" w:w="3126"/>
+            <w:tcW w:type="dxa" w:w="3026"/>
             <w:tcBorders>
               <w:top w:val="single" w:color="808080" w:sz="4"/>
               <w:left w:val="single" w:color="808080" w:sz="4"/>
@@ -3359,7 +3359,7 @@
         </w:trPr>
         <w:tc>
           <w:tcPr>
-            <w:tcW w:type="dxa" w:w="2300"/>
+            <w:tcW w:type="dxa" w:w="2800"/>
             <w:tcBorders>
               <w:top w:val="single" w:color="808080" w:sz="4"/>
               <w:left w:val="single" w:color="808080" w:sz="4"/>
@@ -3421,7 +3421,7 @@
         </w:tc>
         <w:tc>
           <w:tcPr>
-            <w:tcW w:type="dxa" w:w="2300"/>
+            <w:tcW w:type="dxa" w:w="1900"/>
             <w:tcBorders>
               <w:top w:val="single" w:color="808080" w:sz="4"/>
               <w:left w:val="single" w:color="808080" w:sz="4"/>
@@ -3452,7 +3452,7 @@
         </w:tc>
         <w:tc>
           <w:tcPr>
-            <w:tcW w:type="dxa" w:w="3126"/>
+            <w:tcW w:type="dxa" w:w="3026"/>
             <w:tcBorders>
               <w:top w:val="single" w:color="808080" w:sz="4"/>
               <w:left w:val="single" w:color="808080" w:sz="4"/>
@@ -3488,32 +3488,32 @@
         </w:trPr>
         <w:tc>
           <w:tcPr>
-            <w:tcW w:type="dxa" w:w="2300"/>
-            <w:tcBorders>
-              <w:top w:val="single" w:color="808080" w:sz="4"/>
-              <w:left w:val="single" w:color="808080" w:sz="4"/>
-              <w:bottom w:val="single" w:color="808080" w:sz="4"/>
-              <w:right w:val="single" w:color="808080" w:sz="4"/>
-            </w:tcBorders>
-            <w:tcMar>
-              <w:top w:type="dxa" w:w="60"/>
-              <w:left w:type="dxa" w:w="90"/>
-              <w:bottom w:type="dxa" w:w="60"/>
-              <w:right w:type="dxa" w:w="90"/>
-            </w:tcMar>
-          </w:tcPr>
-          <w:p>
-            <w:pPr>
-              <w:spacing w:after="20"/>
-              <w:jc w:val="left"/>
-            </w:pPr>
-            <w:r>
-              <w:rPr>
-                <w:rFonts w:ascii="Times New Roman" w:cs="Times New Roman" w:eastAsia="Times New Roman" w:hAnsi="Times New Roman"/>
-                <w:sz w:val="18"/>
-                <w:szCs w:val="18"/>
-              </w:rPr>
-              <w:t xml:space="preserve">CHUNKS.text</w:t>
+            <w:tcW w:type="dxa" w:w="2800"/>
+            <w:tcBorders>
+              <w:top w:val="single" w:color="808080" w:sz="4"/>
+              <w:left w:val="single" w:color="808080" w:sz="4"/>
+              <w:bottom w:val="single" w:color="808080" w:sz="4"/>
+              <w:right w:val="single" w:color="808080" w:sz="4"/>
+            </w:tcBorders>
+            <w:tcMar>
+              <w:top w:type="dxa" w:w="60"/>
+              <w:left w:type="dxa" w:w="90"/>
+              <w:bottom w:type="dxa" w:w="60"/>
+              <w:right w:type="dxa" w:w="90"/>
+            </w:tcMar>
+          </w:tcPr>
+          <w:p>
+            <w:pPr>
+              <w:spacing w:after="20"/>
+              <w:jc w:val="left"/>
+            </w:pPr>
+            <w:r>
+              <w:rPr>
+                <w:rFonts w:ascii="Times New Roman" w:cs="Times New Roman" w:eastAsia="Times New Roman" w:hAnsi="Times New Roman"/>
+                <w:sz w:val="18"/>
+                <w:szCs w:val="18"/>
+              </w:rPr>
+              <w:t xml:space="preserve">CHUNKS.raw_text</w:t>
             </w:r>
           </w:p>
         </w:tc>
@@ -3550,7 +3550,7 @@
         </w:tc>
         <w:tc>
           <w:tcPr>
-            <w:tcW w:type="dxa" w:w="2300"/>
+            <w:tcW w:type="dxa" w:w="1900"/>
             <w:tcBorders>
               <w:top w:val="single" w:color="808080" w:sz="4"/>
               <w:left w:val="single" w:color="808080" w:sz="4"/>
@@ -3581,32 +3581,32 @@
         </w:tc>
         <w:tc>
           <w:tcPr>
-            <w:tcW w:type="dxa" w:w="3126"/>
-            <w:tcBorders>
-              <w:top w:val="single" w:color="808080" w:sz="4"/>
-              <w:left w:val="single" w:color="808080" w:sz="4"/>
-              <w:bottom w:val="single" w:color="808080" w:sz="4"/>
-              <w:right w:val="single" w:color="808080" w:sz="4"/>
-            </w:tcBorders>
-            <w:tcMar>
-              <w:top w:type="dxa" w:w="60"/>
-              <w:left w:type="dxa" w:w="90"/>
-              <w:bottom w:type="dxa" w:w="60"/>
-              <w:right w:type="dxa" w:w="90"/>
-            </w:tcMar>
-          </w:tcPr>
-          <w:p>
-            <w:pPr>
-              <w:spacing w:after="20"/>
-              <w:jc w:val="left"/>
-            </w:pPr>
-            <w:r>
-              <w:rPr>
-                <w:rFonts w:ascii="Times New Roman" w:cs="Times New Roman" w:eastAsia="Times New Roman" w:hAnsi="Times New Roman"/>
-                <w:sz w:val="18"/>
-                <w:szCs w:val="18"/>
-              </w:rPr>
-              <w:t xml:space="preserve">Normalized text of 200 to 400 tokens (used for BM25 and snippets).</w:t>
+            <w:tcW w:type="dxa" w:w="3026"/>
+            <w:tcBorders>
+              <w:top w:val="single" w:color="808080" w:sz="4"/>
+              <w:left w:val="single" w:color="808080" w:sz="4"/>
+              <w:bottom w:val="single" w:color="808080" w:sz="4"/>
+              <w:right w:val="single" w:color="808080" w:sz="4"/>
+            </w:tcBorders>
+            <w:tcMar>
+              <w:top w:type="dxa" w:w="60"/>
+              <w:left w:type="dxa" w:w="90"/>
+              <w:bottom w:type="dxa" w:w="60"/>
+              <w:right w:type="dxa" w:w="90"/>
+            </w:tcMar>
+          </w:tcPr>
+          <w:p>
+            <w:pPr>
+              <w:spacing w:after="20"/>
+              <w:jc w:val="left"/>
+            </w:pPr>
+            <w:r>
+              <w:rPr>
+                <w:rFonts w:ascii="Times New Roman" w:cs="Times New Roman" w:eastAsia="Times New Roman" w:hAnsi="Times New Roman"/>
+                <w:sz w:val="18"/>
+                <w:szCs w:val="18"/>
+              </w:rPr>
+              <w:t xml:space="preserve">Chunk text exactly as recognized by the OCR, before normalization (what the page shows; used for result snippets).</w:t>
             </w:r>
           </w:p>
         </w:tc>
@@ -3617,32 +3617,32 @@
         </w:trPr>
         <w:tc>
           <w:tcPr>
-            <w:tcW w:type="dxa" w:w="2300"/>
-            <w:tcBorders>
-              <w:top w:val="single" w:color="808080" w:sz="4"/>
-              <w:left w:val="single" w:color="808080" w:sz="4"/>
-              <w:bottom w:val="single" w:color="808080" w:sz="4"/>
-              <w:right w:val="single" w:color="808080" w:sz="4"/>
-            </w:tcBorders>
-            <w:tcMar>
-              <w:top w:type="dxa" w:w="60"/>
-              <w:left w:type="dxa" w:w="90"/>
-              <w:bottom w:type="dxa" w:w="60"/>
-              <w:right w:type="dxa" w:w="90"/>
-            </w:tcMar>
-          </w:tcPr>
-          <w:p>
-            <w:pPr>
-              <w:spacing w:after="20"/>
-              <w:jc w:val="left"/>
-            </w:pPr>
-            <w:r>
-              <w:rPr>
-                <w:rFonts w:ascii="Times New Roman" w:cs="Times New Roman" w:eastAsia="Times New Roman" w:hAnsi="Times New Roman"/>
-                <w:sz w:val="18"/>
-                <w:szCs w:val="18"/>
-              </w:rPr>
-              <w:t xml:space="preserve">CHUNKS.bbox_x, bbox_y, bbox_w, bbox_h</w:t>
+            <w:tcW w:type="dxa" w:w="2800"/>
+            <w:tcBorders>
+              <w:top w:val="single" w:color="808080" w:sz="4"/>
+              <w:left w:val="single" w:color="808080" w:sz="4"/>
+              <w:bottom w:val="single" w:color="808080" w:sz="4"/>
+              <w:right w:val="single" w:color="808080" w:sz="4"/>
+            </w:tcBorders>
+            <w:tcMar>
+              <w:top w:type="dxa" w:w="60"/>
+              <w:left w:type="dxa" w:w="90"/>
+              <w:bottom w:type="dxa" w:w="60"/>
+              <w:right w:type="dxa" w:w="90"/>
+            </w:tcMar>
+          </w:tcPr>
+          <w:p>
+            <w:pPr>
+              <w:spacing w:after="20"/>
+              <w:jc w:val="left"/>
+            </w:pPr>
+            <w:r>
+              <w:rPr>
+                <w:rFonts w:ascii="Times New Roman" w:cs="Times New Roman" w:eastAsia="Times New Roman" w:hAnsi="Times New Roman"/>
+                <w:sz w:val="18"/>
+                <w:szCs w:val="18"/>
+              </w:rPr>
+              <w:t xml:space="preserve">CHUNKS.norm_text</w:t>
             </w:r>
           </w:p>
         </w:tc>
@@ -3673,69 +3673,69 @@
                 <w:sz w:val="18"/>
                 <w:szCs w:val="18"/>
               </w:rPr>
-              <w:t xml:space="preserve">FLOAT</w:t>
-            </w:r>
-          </w:p>
-        </w:tc>
-        <w:tc>
-          <w:tcPr>
-            <w:tcW w:type="dxa" w:w="2300"/>
-            <w:tcBorders>
-              <w:top w:val="single" w:color="808080" w:sz="4"/>
-              <w:left w:val="single" w:color="808080" w:sz="4"/>
-              <w:bottom w:val="single" w:color="808080" w:sz="4"/>
-              <w:right w:val="single" w:color="808080" w:sz="4"/>
-            </w:tcBorders>
-            <w:tcMar>
-              <w:top w:type="dxa" w:w="60"/>
-              <w:left w:type="dxa" w:w="90"/>
-              <w:bottom w:type="dxa" w:w="60"/>
-              <w:right w:type="dxa" w:w="90"/>
-            </w:tcMar>
-          </w:tcPr>
-          <w:p>
-            <w:pPr>
-              <w:spacing w:after="20"/>
-              <w:jc w:val="left"/>
-            </w:pPr>
-            <w:r>
-              <w:rPr>
-                <w:rFonts w:ascii="Times New Roman" w:cs="Times New Roman" w:eastAsia="Times New Roman" w:hAnsi="Times New Roman"/>
-                <w:sz w:val="18"/>
-                <w:szCs w:val="18"/>
-              </w:rPr>
-              <w:t xml:space="preserve">between 0 and 1</w:t>
-            </w:r>
-          </w:p>
-        </w:tc>
-        <w:tc>
-          <w:tcPr>
-            <w:tcW w:type="dxa" w:w="3126"/>
-            <w:tcBorders>
-              <w:top w:val="single" w:color="808080" w:sz="4"/>
-              <w:left w:val="single" w:color="808080" w:sz="4"/>
-              <w:bottom w:val="single" w:color="808080" w:sz="4"/>
-              <w:right w:val="single" w:color="808080" w:sz="4"/>
-            </w:tcBorders>
-            <w:tcMar>
-              <w:top w:type="dxa" w:w="60"/>
-              <w:left w:type="dxa" w:w="90"/>
-              <w:bottom w:type="dxa" w:w="60"/>
-              <w:right w:type="dxa" w:w="90"/>
-            </w:tcMar>
-          </w:tcPr>
-          <w:p>
-            <w:pPr>
-              <w:spacing w:after="20"/>
-              <w:jc w:val="left"/>
-            </w:pPr>
-            <w:r>
-              <w:rPr>
-                <w:rFonts w:ascii="Times New Roman" w:cs="Times New Roman" w:eastAsia="Times New Roman" w:hAnsi="Times New Roman"/>
-                <w:sz w:val="18"/>
-                <w:szCs w:val="18"/>
-              </w:rPr>
-              <w:t xml:space="preserve">Normalized bounding box (fractions of page width and height; origin top-left).</w:t>
+              <w:t xml:space="preserve">TEXT</w:t>
+            </w:r>
+          </w:p>
+        </w:tc>
+        <w:tc>
+          <w:tcPr>
+            <w:tcW w:type="dxa" w:w="1900"/>
+            <w:tcBorders>
+              <w:top w:val="single" w:color="808080" w:sz="4"/>
+              <w:left w:val="single" w:color="808080" w:sz="4"/>
+              <w:bottom w:val="single" w:color="808080" w:sz="4"/>
+              <w:right w:val="single" w:color="808080" w:sz="4"/>
+            </w:tcBorders>
+            <w:tcMar>
+              <w:top w:type="dxa" w:w="60"/>
+              <w:left w:type="dxa" w:w="90"/>
+              <w:bottom w:type="dxa" w:w="60"/>
+              <w:right w:type="dxa" w:w="90"/>
+            </w:tcMar>
+          </w:tcPr>
+          <w:p>
+            <w:pPr>
+              <w:spacing w:after="20"/>
+              <w:jc w:val="left"/>
+            </w:pPr>
+            <w:r>
+              <w:rPr>
+                <w:rFonts w:ascii="Times New Roman" w:cs="Times New Roman" w:eastAsia="Times New Roman" w:hAnsi="Times New Roman"/>
+                <w:sz w:val="18"/>
+                <w:szCs w:val="18"/>
+              </w:rPr>
+              <w:t xml:space="preserve">NOT NULL</w:t>
+            </w:r>
+          </w:p>
+        </w:tc>
+        <w:tc>
+          <w:tcPr>
+            <w:tcW w:type="dxa" w:w="3026"/>
+            <w:tcBorders>
+              <w:top w:val="single" w:color="808080" w:sz="4"/>
+              <w:left w:val="single" w:color="808080" w:sz="4"/>
+              <w:bottom w:val="single" w:color="808080" w:sz="4"/>
+              <w:right w:val="single" w:color="808080" w:sz="4"/>
+            </w:tcBorders>
+            <w:tcMar>
+              <w:top w:type="dxa" w:w="60"/>
+              <w:left w:type="dxa" w:w="90"/>
+              <w:bottom w:type="dxa" w:w="60"/>
+              <w:right w:type="dxa" w:w="90"/>
+            </w:tcMar>
+          </w:tcPr>
+          <w:p>
+            <w:pPr>
+              <w:spacing w:after="20"/>
+              <w:jc w:val="left"/>
+            </w:pPr>
+            <w:r>
+              <w:rPr>
+                <w:rFonts w:ascii="Times New Roman" w:cs="Times New Roman" w:eastAsia="Times New Roman" w:hAnsi="Times New Roman"/>
+                <w:sz w:val="18"/>
+                <w:szCs w:val="18"/>
+              </w:rPr>
+              <w:t xml:space="preserve">Chunk text after Amharic normalization (homophones unified, punctuation cleaned), 200 to 400 tokens; used for BM25 and for the embedding.</w:t>
             </w:r>
           </w:p>
         </w:tc>
@@ -3746,7 +3746,265 @@
         </w:trPr>
         <w:tc>
           <w:tcPr>
-            <w:tcW w:type="dxa" w:w="2300"/>
+            <w:tcW w:type="dxa" w:w="2800"/>
+            <w:tcBorders>
+              <w:top w:val="single" w:color="808080" w:sz="4"/>
+              <w:left w:val="single" w:color="808080" w:sz="4"/>
+              <w:bottom w:val="single" w:color="808080" w:sz="4"/>
+              <w:right w:val="single" w:color="808080" w:sz="4"/>
+            </w:tcBorders>
+            <w:tcMar>
+              <w:top w:type="dxa" w:w="60"/>
+              <w:left w:type="dxa" w:w="90"/>
+              <w:bottom w:type="dxa" w:w="60"/>
+              <w:right w:type="dxa" w:w="90"/>
+            </w:tcMar>
+          </w:tcPr>
+          <w:p>
+            <w:pPr>
+              <w:spacing w:after="20"/>
+              <w:jc w:val="left"/>
+            </w:pPr>
+            <w:r>
+              <w:rPr>
+                <w:rFonts w:ascii="Times New Roman" w:cs="Times New Roman" w:eastAsia="Times New Roman" w:hAnsi="Times New Roman"/>
+                <w:sz w:val="18"/>
+                <w:szCs w:val="18"/>
+              </w:rPr>
+              <w:t xml:space="preserve">CHUNKS.normalizer_version</w:t>
+            </w:r>
+          </w:p>
+        </w:tc>
+        <w:tc>
+          <w:tcPr>
+            <w:tcW w:type="dxa" w:w="1300"/>
+            <w:tcBorders>
+              <w:top w:val="single" w:color="808080" w:sz="4"/>
+              <w:left w:val="single" w:color="808080" w:sz="4"/>
+              <w:bottom w:val="single" w:color="808080" w:sz="4"/>
+              <w:right w:val="single" w:color="808080" w:sz="4"/>
+            </w:tcBorders>
+            <w:tcMar>
+              <w:top w:type="dxa" w:w="60"/>
+              <w:left w:type="dxa" w:w="90"/>
+              <w:bottom w:type="dxa" w:w="60"/>
+              <w:right w:type="dxa" w:w="90"/>
+            </w:tcMar>
+          </w:tcPr>
+          <w:p>
+            <w:pPr>
+              <w:spacing w:after="20"/>
+              <w:jc w:val="left"/>
+            </w:pPr>
+            <w:r>
+              <w:rPr>
+                <w:rFonts w:ascii="Times New Roman" w:cs="Times New Roman" w:eastAsia="Times New Roman" w:hAnsi="Times New Roman"/>
+                <w:sz w:val="18"/>
+                <w:szCs w:val="18"/>
+              </w:rPr>
+              <w:t xml:space="preserve">VARCHAR(20)</w:t>
+            </w:r>
+          </w:p>
+        </w:tc>
+        <w:tc>
+          <w:tcPr>
+            <w:tcW w:type="dxa" w:w="1900"/>
+            <w:tcBorders>
+              <w:top w:val="single" w:color="808080" w:sz="4"/>
+              <w:left w:val="single" w:color="808080" w:sz="4"/>
+              <w:bottom w:val="single" w:color="808080" w:sz="4"/>
+              <w:right w:val="single" w:color="808080" w:sz="4"/>
+            </w:tcBorders>
+            <w:tcMar>
+              <w:top w:type="dxa" w:w="60"/>
+              <w:left w:type="dxa" w:w="90"/>
+              <w:bottom w:type="dxa" w:w="60"/>
+              <w:right w:type="dxa" w:w="90"/>
+            </w:tcMar>
+          </w:tcPr>
+          <w:p>
+            <w:pPr>
+              <w:spacing w:after="20"/>
+              <w:jc w:val="left"/>
+            </w:pPr>
+            <w:r>
+              <w:rPr>
+                <w:rFonts w:ascii="Times New Roman" w:cs="Times New Roman" w:eastAsia="Times New Roman" w:hAnsi="Times New Roman"/>
+                <w:sz w:val="18"/>
+                <w:szCs w:val="18"/>
+              </w:rPr>
+              <w:t xml:space="preserve">NOT NULL</w:t>
+            </w:r>
+          </w:p>
+        </w:tc>
+        <w:tc>
+          <w:tcPr>
+            <w:tcW w:type="dxa" w:w="3026"/>
+            <w:tcBorders>
+              <w:top w:val="single" w:color="808080" w:sz="4"/>
+              <w:left w:val="single" w:color="808080" w:sz="4"/>
+              <w:bottom w:val="single" w:color="808080" w:sz="4"/>
+              <w:right w:val="single" w:color="808080" w:sz="4"/>
+            </w:tcBorders>
+            <w:tcMar>
+              <w:top w:type="dxa" w:w="60"/>
+              <w:left w:type="dxa" w:w="90"/>
+              <w:bottom w:type="dxa" w:w="60"/>
+              <w:right w:type="dxa" w:w="90"/>
+            </w:tcMar>
+          </w:tcPr>
+          <w:p>
+            <w:pPr>
+              <w:spacing w:after="20"/>
+              <w:jc w:val="left"/>
+            </w:pPr>
+            <w:r>
+              <w:rPr>
+                <w:rFonts w:ascii="Times New Roman" w:cs="Times New Roman" w:eastAsia="Times New Roman" w:hAnsi="Times New Roman"/>
+                <w:sz w:val="18"/>
+                <w:szCs w:val="18"/>
+              </w:rPr>
+              <w:t xml:space="preserve">Version of the normalization rules that produced norm_text (for example 1.0), so that chunks can be re-normalized and re-indexed when the rules change.</w:t>
+            </w:r>
+          </w:p>
+        </w:tc>
+      </w:tr>
+      <w:tr>
+        <w:trPr>
+          <w:cantSplit/>
+        </w:trPr>
+        <w:tc>
+          <w:tcPr>
+            <w:tcW w:type="dxa" w:w="2800"/>
+            <w:tcBorders>
+              <w:top w:val="single" w:color="808080" w:sz="4"/>
+              <w:left w:val="single" w:color="808080" w:sz="4"/>
+              <w:bottom w:val="single" w:color="808080" w:sz="4"/>
+              <w:right w:val="single" w:color="808080" w:sz="4"/>
+            </w:tcBorders>
+            <w:tcMar>
+              <w:top w:type="dxa" w:w="60"/>
+              <w:left w:type="dxa" w:w="90"/>
+              <w:bottom w:type="dxa" w:w="60"/>
+              <w:right w:type="dxa" w:w="90"/>
+            </w:tcMar>
+          </w:tcPr>
+          <w:p>
+            <w:pPr>
+              <w:spacing w:after="20"/>
+              <w:jc w:val="left"/>
+            </w:pPr>
+            <w:r>
+              <w:rPr>
+                <w:rFonts w:ascii="Times New Roman" w:cs="Times New Roman" w:eastAsia="Times New Roman" w:hAnsi="Times New Roman"/>
+                <w:sz w:val="18"/>
+                <w:szCs w:val="18"/>
+              </w:rPr>
+              <w:t xml:space="preserve">CHUNKS.bbox_x, bbox_y, bbox_w, bbox_h</w:t>
+            </w:r>
+          </w:p>
+        </w:tc>
+        <w:tc>
+          <w:tcPr>
+            <w:tcW w:type="dxa" w:w="1300"/>
+            <w:tcBorders>
+              <w:top w:val="single" w:color="808080" w:sz="4"/>
+              <w:left w:val="single" w:color="808080" w:sz="4"/>
+              <w:bottom w:val="single" w:color="808080" w:sz="4"/>
+              <w:right w:val="single" w:color="808080" w:sz="4"/>
+            </w:tcBorders>
+            <w:tcMar>
+              <w:top w:type="dxa" w:w="60"/>
+              <w:left w:type="dxa" w:w="90"/>
+              <w:bottom w:type="dxa" w:w="60"/>
+              <w:right w:type="dxa" w:w="90"/>
+            </w:tcMar>
+          </w:tcPr>
+          <w:p>
+            <w:pPr>
+              <w:spacing w:after="20"/>
+              <w:jc w:val="left"/>
+            </w:pPr>
+            <w:r>
+              <w:rPr>
+                <w:rFonts w:ascii="Times New Roman" w:cs="Times New Roman" w:eastAsia="Times New Roman" w:hAnsi="Times New Roman"/>
+                <w:sz w:val="18"/>
+                <w:szCs w:val="18"/>
+              </w:rPr>
+              <w:t xml:space="preserve">FLOAT</w:t>
+            </w:r>
+          </w:p>
+        </w:tc>
+        <w:tc>
+          <w:tcPr>
+            <w:tcW w:type="dxa" w:w="1900"/>
+            <w:tcBorders>
+              <w:top w:val="single" w:color="808080" w:sz="4"/>
+              <w:left w:val="single" w:color="808080" w:sz="4"/>
+              <w:bottom w:val="single" w:color="808080" w:sz="4"/>
+              <w:right w:val="single" w:color="808080" w:sz="4"/>
+            </w:tcBorders>
+            <w:tcMar>
+              <w:top w:type="dxa" w:w="60"/>
+              <w:left w:type="dxa" w:w="90"/>
+              <w:bottom w:type="dxa" w:w="60"/>
+              <w:right w:type="dxa" w:w="90"/>
+            </w:tcMar>
+          </w:tcPr>
+          <w:p>
+            <w:pPr>
+              <w:spacing w:after="20"/>
+              <w:jc w:val="left"/>
+            </w:pPr>
+            <w:r>
+              <w:rPr>
+                <w:rFonts w:ascii="Times New Roman" w:cs="Times New Roman" w:eastAsia="Times New Roman" w:hAnsi="Times New Roman"/>
+                <w:sz w:val="18"/>
+                <w:szCs w:val="18"/>
+              </w:rPr>
+              <w:t xml:space="preserve">between 0 and 1</w:t>
+            </w:r>
+          </w:p>
+        </w:tc>
+        <w:tc>
+          <w:tcPr>
+            <w:tcW w:type="dxa" w:w="3026"/>
+            <w:tcBorders>
+              <w:top w:val="single" w:color="808080" w:sz="4"/>
+              <w:left w:val="single" w:color="808080" w:sz="4"/>
+              <w:bottom w:val="single" w:color="808080" w:sz="4"/>
+              <w:right w:val="single" w:color="808080" w:sz="4"/>
+            </w:tcBorders>
+            <w:tcMar>
+              <w:top w:type="dxa" w:w="60"/>
+              <w:left w:type="dxa" w:w="90"/>
+              <w:bottom w:type="dxa" w:w="60"/>
+              <w:right w:type="dxa" w:w="90"/>
+            </w:tcMar>
+          </w:tcPr>
+          <w:p>
+            <w:pPr>
+              <w:spacing w:after="20"/>
+              <w:jc w:val="left"/>
+            </w:pPr>
+            <w:r>
+              <w:rPr>
+                <w:rFonts w:ascii="Times New Roman" w:cs="Times New Roman" w:eastAsia="Times New Roman" w:hAnsi="Times New Roman"/>
+                <w:sz w:val="18"/>
+                <w:szCs w:val="18"/>
+              </w:rPr>
+              <w:t xml:space="preserve">Normalized bounding box (fractions of page width and height; origin top-left).</w:t>
+            </w:r>
+          </w:p>
+        </w:tc>
+      </w:tr>
+      <w:tr>
+        <w:trPr>
+          <w:cantSplit/>
+        </w:trPr>
+        <w:tc>
+          <w:tcPr>
+            <w:tcW w:type="dxa" w:w="2800"/>
             <w:tcBorders>
               <w:top w:val="single" w:color="808080" w:sz="4"/>
               <w:left w:val="single" w:color="808080" w:sz="4"/>
@@ -3808,7 +4066,7 @@
         </w:tc>
         <w:tc>
           <w:tcPr>
-            <w:tcW w:type="dxa" w:w="2300"/>
+            <w:tcW w:type="dxa" w:w="1900"/>
             <w:tcBorders>
               <w:top w:val="single" w:color="808080" w:sz="4"/>
               <w:left w:val="single" w:color="808080" w:sz="4"/>
@@ -3839,7 +4097,7 @@
         </w:tc>
         <w:tc>
           <w:tcPr>
-            <w:tcW w:type="dxa" w:w="3126"/>
+            <w:tcW w:type="dxa" w:w="3026"/>
             <w:tcBorders>
               <w:top w:val="single" w:color="808080" w:sz="4"/>
               <w:left w:val="single" w:color="808080" w:sz="4"/>
@@ -3870,6 +4128,31 @@
         </w:tc>
       </w:tr>
     </w:tbl>
+    <w:p>
+      <w:pPr>
+        <w:spacing w:after="120"/>
+      </w:pPr>
+    </w:p>
+    <w:p>
+      <w:pPr>
+        <w:spacing w:after="120" w:line="300"/>
+        <w:jc w:val="both"/>
+      </w:pPr>
+      <w:r>
+        <w:rPr>
+          <w:rFonts w:ascii="Times New Roman" w:cs="Times New Roman" w:eastAsia="Times New Roman" w:hAnsi="Times New Roman"/>
+          <w:b/>
+          <w:bCs/>
+        </w:rPr>
+        <w:t xml:space="preserve">Status of this annex.</w:t>
+      </w:r>
+      <w:r>
+        <w:rPr>
+          <w:rFonts w:ascii="Times New Roman" w:cs="Times New Roman" w:eastAsia="Times New Roman" w:hAnsi="Times New Roman"/>
+        </w:rPr>
+        <w:t xml:space="preserve"> The columns raw_text, norm_text and normalizer_version replace the earlier single text column. The final column list is to be confirmed with the backend owner (Semir Sultan) before the entity-relationship diagram in Figure B.1 is redrawn, so the diagram still shows the earlier single text column. The same check should settle how several bounding boxes per chunk (the bboxes array returned by the API) are stored, because bbox_x to bbox_h hold only one box.</w:t>
+      </w:r>
+    </w:p>
     <w:p>
       <w:pPr>
         <w:pStyle w:val="Heading1"/>
@@ -4491,7 +4774,7 @@
                 <w:sz w:val="18"/>
                 <w:szCs w:val="18"/>
               </w:rPr>
-              <w:t xml:space="preserve">3. System draws a highlight at the result's bounding box and scrolls it into view.</w:t>
+              <w:t xml:space="preserve">3. System draws a highlight at each of the result's bounding boxes and scrolls the first one into view.</w:t>
             </w:r>
           </w:p>
           <w:p>
@@ -4743,7 +5026,7 @@
                 <w:sz w:val="18"/>
                 <w:szCs w:val="18"/>
               </w:rPr>
-              <w:t xml:space="preserve">The matched passage is visible on the original page.</w:t>
+              <w:t xml:space="preserve">The matched passage is visible on the page image.</w:t>
             </w:r>
           </w:p>
         </w:tc>
@@ -5349,6 +5632,20 @@
               <w:t xml:space="preserve">4a. Processing fails: status “failed” with the reason.</w:t>
             </w:r>
           </w:p>
+          <w:p>
+            <w:pPr>
+              <w:spacing w:after="20"/>
+              <w:jc w:val="left"/>
+            </w:pPr>
+            <w:r>
+              <w:rPr>
+                <w:rFonts w:ascii="Times New Roman" w:cs="Times New Roman" w:eastAsia="Times New Roman" w:hAnsi="Times New Roman"/>
+                <w:sz w:val="18"/>
+                <w:szCs w:val="18"/>
+              </w:rPr>
+              <w:t xml:space="preserve">4b. Upload fails: the error message sent by the backend is shown in the file’s row.</w:t>
+            </w:r>
+          </w:p>
         </w:tc>
         <w:tc>
           <w:tcPr>
@@ -5378,6 +5675,20 @@
                 <w:szCs w:val="18"/>
               </w:rPr>
               <w:t xml:space="preserve">2a. Administrator cancels: nothing changes.</w:t>
+            </w:r>
+          </w:p>
+          <w:p>
+            <w:pPr>
+              <w:spacing w:after="20"/>
+              <w:jc w:val="left"/>
+            </w:pPr>
+            <w:r>
+              <w:rPr>
+                <w:rFonts w:ascii="Times New Roman" w:cs="Times New Roman" w:eastAsia="Times New Roman" w:hAnsi="Times New Roman"/>
+                <w:sz w:val="18"/>
+                <w:szCs w:val="18"/>
+              </w:rPr>
+              <w:t xml:space="preserve">3a. Deletion fails (for example, the document is still being indexed): the reason is shown and the document stays listed.</w:t>
             </w:r>
           </w:p>
         </w:tc>
@@ -6203,7 +6514,7 @@
                 <w:sz w:val="20"/>
                 <w:szCs w:val="20"/>
               </w:rPr>
-              <w:t xml:space="preserve">List ranked passages and show the highlighted original page.</w:t>
+              <w:t xml:space="preserve">List ranked passages and show the page image with the highlighted passage.</w:t>
             </w:r>
           </w:p>
         </w:tc>
@@ -7383,7 +7694,7 @@
                 <w:sz w:val="20"/>
                 <w:szCs w:val="20"/>
               </w:rPr>
-              <w:t xml:space="preserve">Dashed hatched region is the matched passage; it scrolls into view and scales with zoom.</w:t>
+              <w:t xml:space="preserve">Dashed hatched region(s) show the matched passage (one per line when the API sends several boxes); the first scrolls into view and all scale with zoom.</w:t>
             </w:r>
           </w:p>
         </w:tc>
@@ -8094,7 +8405,7 @@
                 <w:sz w:val="20"/>
                 <w:szCs w:val="20"/>
               </w:rPr>
-              <w:t xml:space="preserve">Tells the user that selecting a result shows the original page.</w:t>
+              <w:t xml:space="preserve">Tells the user that selecting a result shows the page image.</w:t>
             </w:r>
           </w:p>
         </w:tc>
@@ -10644,7 +10955,7 @@
                 <w:sz w:val="18"/>
                 <w:szCs w:val="18"/>
               </w:rPr>
-              <w:t xml:space="preserve">Per-file message (type, size, network)</w:t>
+              <w:t xml:space="preserve">Per-file message (type, size, network, or the backend’s own message)</w:t>
             </w:r>
           </w:p>
         </w:tc>
@@ -10804,7 +11115,7 @@
                 <w:sz w:val="18"/>
                 <w:szCs w:val="18"/>
               </w:rPr>
-              <w:t xml:space="preserve">Status badge Failed</w:t>
+              <w:t xml:space="preserve">Message “The document list could not be loaded” with Retry; a failed delete shows the reason; status badge Failed</w:t>
             </w:r>
           </w:p>
         </w:tc>
@@ -10836,6 +11147,166 @@
                 <w:szCs w:val="18"/>
               </w:rPr>
               <w:t xml:space="preserve">Status badge Indexed</w:t>
+            </w:r>
+          </w:p>
+        </w:tc>
+      </w:tr>
+      <w:tr>
+        <w:trPr>
+          <w:cantSplit/>
+        </w:trPr>
+        <w:tc>
+          <w:tcPr>
+            <w:tcW w:type="dxa" w:w="1300"/>
+            <w:tcBorders>
+              <w:top w:val="single" w:color="808080" w:sz="4"/>
+              <w:left w:val="single" w:color="808080" w:sz="4"/>
+              <w:bottom w:val="single" w:color="808080" w:sz="4"/>
+              <w:right w:val="single" w:color="808080" w:sz="4"/>
+            </w:tcBorders>
+            <w:tcMar>
+              <w:top w:type="dxa" w:w="60"/>
+              <w:left w:type="dxa" w:w="90"/>
+              <w:bottom w:type="dxa" w:w="60"/>
+              <w:right w:type="dxa" w:w="90"/>
+            </w:tcMar>
+          </w:tcPr>
+          <w:p>
+            <w:pPr>
+              <w:spacing w:after="20"/>
+              <w:jc w:val="left"/>
+            </w:pPr>
+            <w:r>
+              <w:rPr>
+                <w:rFonts w:ascii="Times New Roman" w:cs="Times New Roman" w:eastAsia="Times New Roman" w:hAnsi="Times New Roman"/>
+                <w:sz w:val="18"/>
+                <w:szCs w:val="18"/>
+              </w:rPr>
+              <w:t xml:space="preserve">Admin session</w:t>
+            </w:r>
+          </w:p>
+        </w:tc>
+        <w:tc>
+          <w:tcPr>
+            <w:tcW w:type="dxa" w:w="1900"/>
+            <w:tcBorders>
+              <w:top w:val="single" w:color="808080" w:sz="4"/>
+              <w:left w:val="single" w:color="808080" w:sz="4"/>
+              <w:bottom w:val="single" w:color="808080" w:sz="4"/>
+              <w:right w:val="single" w:color="808080" w:sz="4"/>
+            </w:tcBorders>
+            <w:tcMar>
+              <w:top w:type="dxa" w:w="60"/>
+              <w:left w:type="dxa" w:w="90"/>
+              <w:bottom w:type="dxa" w:w="60"/>
+              <w:right w:type="dxa" w:w="90"/>
+            </w:tcMar>
+          </w:tcPr>
+          <w:p>
+            <w:pPr>
+              <w:spacing w:after="20"/>
+              <w:jc w:val="left"/>
+            </w:pPr>
+            <w:r>
+              <w:rPr>
+                <w:rFonts w:ascii="Times New Roman" w:cs="Times New Roman" w:eastAsia="Times New Roman" w:hAnsi="Times New Roman"/>
+                <w:sz w:val="18"/>
+                <w:szCs w:val="18"/>
+              </w:rPr>
+              <w:t xml:space="preserve">—</w:t>
+            </w:r>
+          </w:p>
+        </w:tc>
+        <w:tc>
+          <w:tcPr>
+            <w:tcW w:type="dxa" w:w="1700"/>
+            <w:tcBorders>
+              <w:top w:val="single" w:color="808080" w:sz="4"/>
+              <w:left w:val="single" w:color="808080" w:sz="4"/>
+              <w:bottom w:val="single" w:color="808080" w:sz="4"/>
+              <w:right w:val="single" w:color="808080" w:sz="4"/>
+            </w:tcBorders>
+            <w:tcMar>
+              <w:top w:type="dxa" w:w="60"/>
+              <w:left w:type="dxa" w:w="90"/>
+              <w:bottom w:type="dxa" w:w="60"/>
+              <w:right w:type="dxa" w:w="90"/>
+            </w:tcMar>
+          </w:tcPr>
+          <w:p>
+            <w:pPr>
+              <w:spacing w:after="20"/>
+              <w:jc w:val="left"/>
+            </w:pPr>
+            <w:r>
+              <w:rPr>
+                <w:rFonts w:ascii="Times New Roman" w:cs="Times New Roman" w:eastAsia="Times New Roman" w:hAnsi="Times New Roman"/>
+                <w:sz w:val="18"/>
+                <w:szCs w:val="18"/>
+              </w:rPr>
+              <w:t xml:space="preserve">—</w:t>
+            </w:r>
+          </w:p>
+        </w:tc>
+        <w:tc>
+          <w:tcPr>
+            <w:tcW w:type="dxa" w:w="2326"/>
+            <w:tcBorders>
+              <w:top w:val="single" w:color="808080" w:sz="4"/>
+              <w:left w:val="single" w:color="808080" w:sz="4"/>
+              <w:bottom w:val="single" w:color="808080" w:sz="4"/>
+              <w:right w:val="single" w:color="808080" w:sz="4"/>
+            </w:tcBorders>
+            <w:tcMar>
+              <w:top w:type="dxa" w:w="60"/>
+              <w:left w:type="dxa" w:w="90"/>
+              <w:bottom w:type="dxa" w:w="60"/>
+              <w:right w:type="dxa" w:w="90"/>
+            </w:tcMar>
+          </w:tcPr>
+          <w:p>
+            <w:pPr>
+              <w:spacing w:after="20"/>
+              <w:jc w:val="left"/>
+            </w:pPr>
+            <w:r>
+              <w:rPr>
+                <w:rFonts w:ascii="Times New Roman" w:cs="Times New Roman" w:eastAsia="Times New Roman" w:hAnsi="Times New Roman"/>
+                <w:sz w:val="18"/>
+                <w:szCs w:val="18"/>
+              </w:rPr>
+              <w:t xml:space="preserve">Token expired or invalid (401/403): signed out and sent to the sign-in page with the notice “Your session has expired or is not valid. Sign in again.”</w:t>
+            </w:r>
+          </w:p>
+        </w:tc>
+        <w:tc>
+          <w:tcPr>
+            <w:tcW w:type="dxa" w:w="1800"/>
+            <w:tcBorders>
+              <w:top w:val="single" w:color="808080" w:sz="4"/>
+              <w:left w:val="single" w:color="808080" w:sz="4"/>
+              <w:bottom w:val="single" w:color="808080" w:sz="4"/>
+              <w:right w:val="single" w:color="808080" w:sz="4"/>
+            </w:tcBorders>
+            <w:tcMar>
+              <w:top w:type="dxa" w:w="60"/>
+              <w:left w:type="dxa" w:w="90"/>
+              <w:bottom w:type="dxa" w:w="60"/>
+              <w:right w:type="dxa" w:w="90"/>
+            </w:tcMar>
+          </w:tcPr>
+          <w:p>
+            <w:pPr>
+              <w:spacing w:after="20"/>
+              <w:jc w:val="left"/>
+            </w:pPr>
+            <w:r>
+              <w:rPr>
+                <w:rFonts w:ascii="Times New Roman" w:cs="Times New Roman" w:eastAsia="Times New Roman" w:hAnsi="Times New Roman"/>
+                <w:sz w:val="18"/>
+                <w:szCs w:val="18"/>
+              </w:rPr>
+              <w:t xml:space="preserve">Admin page after signing in again</w:t>
             </w:r>
           </w:p>
         </w:tc>

</xml_diff>